<commit_message>
Hal18 wafaq RTL fix: simpan kanan→kiri — baris1 | ٧٨ | ٨٧ | ٣٤١ | ٢٩٢ | / ٣٤٧ | ٢٩١ | ٧٩ | ٨٣ | / ٢٩٠ | ٣٣٩ | ٨٩ | ٨٠ | / ٨٨ | ٨١ | ٢٨٩ | ٣٤٠ | — bidiVisual + dir rtl — arab/latin asror tidak dilatin-kan — final Hal01-18 6.2M
Co-authored-by: arena-agent <297053741+arena-agent@users.noreply.github.com>
</commit_message>
<xml_diff>
--- a/REVISI_HAL18_WAFAQ_4X4_2_2.docx
+++ b/REVISI_HAL18_WAFAQ_4X4_2_2.docx
@@ -45,6 +45,7 @@
         <w:tblW w:type="auto" w:w="0"/>
         <w:jc w:val="center"/>
         <w:tblLook w:firstColumn="1" w:firstRow="1" w:lastColumn="0" w:lastRow="0" w:noHBand="0" w:noVBand="1" w:val="04A0"/>
+        <w:bidiVisual w:val="1"/>
       </w:tblPr>
       <w:tblGrid>
         <w:gridCol w:w="2509"/>
@@ -67,9 +68,9 @@
               <w:rPr>
                 <w:rFonts w:ascii="Scheherazade New" w:hAnsi="Scheherazade New"/>
                 <w:color w:val="1A237E"/>
-                <w:sz w:val="24"/>
+                <w:sz w:val="22"/>
               </w:rPr>
-              <w:t>٢٩٢</w:t>
+              <w:t>٧٨</w:t>
             </w:r>
           </w:p>
         </w:tc>
@@ -87,9 +88,9 @@
               <w:rPr>
                 <w:rFonts w:ascii="Scheherazade New" w:hAnsi="Scheherazade New"/>
                 <w:color w:val="1A237E"/>
-                <w:sz w:val="24"/>
+                <w:sz w:val="22"/>
               </w:rPr>
-              <w:t>٣٤١</w:t>
+              <w:t>٨٧</w:t>
             </w:r>
           </w:p>
         </w:tc>
@@ -107,9 +108,9 @@
               <w:rPr>
                 <w:rFonts w:ascii="Scheherazade New" w:hAnsi="Scheherazade New"/>
                 <w:color w:val="1A237E"/>
-                <w:sz w:val="24"/>
+                <w:sz w:val="22"/>
               </w:rPr>
-              <w:t>٨٧</w:t>
+              <w:t>٣٤١</w:t>
             </w:r>
           </w:p>
         </w:tc>
@@ -127,9 +128,9 @@
               <w:rPr>
                 <w:rFonts w:ascii="Scheherazade New" w:hAnsi="Scheherazade New"/>
                 <w:color w:val="1A237E"/>
-                <w:sz w:val="24"/>
+                <w:sz w:val="22"/>
               </w:rPr>
-              <w:t>٧٨</w:t>
+              <w:t>٢٩٢</w:t>
             </w:r>
           </w:p>
         </w:tc>
@@ -149,9 +150,9 @@
               <w:rPr>
                 <w:rFonts w:ascii="Scheherazade New" w:hAnsi="Scheherazade New"/>
                 <w:color w:val="1A237E"/>
-                <w:sz w:val="24"/>
+                <w:sz w:val="22"/>
               </w:rPr>
-              <w:t>٨٣</w:t>
+              <w:t>٣٤٧</w:t>
             </w:r>
           </w:p>
         </w:tc>
@@ -169,9 +170,9 @@
               <w:rPr>
                 <w:rFonts w:ascii="Scheherazade New" w:hAnsi="Scheherazade New"/>
                 <w:color w:val="1A237E"/>
-                <w:sz w:val="24"/>
+                <w:sz w:val="22"/>
               </w:rPr>
-              <w:t>٧٩</w:t>
+              <w:t>٢٩١</w:t>
             </w:r>
           </w:p>
         </w:tc>
@@ -189,9 +190,9 @@
               <w:rPr>
                 <w:rFonts w:ascii="Scheherazade New" w:hAnsi="Scheherazade New"/>
                 <w:color w:val="1A237E"/>
-                <w:sz w:val="24"/>
+                <w:sz w:val="22"/>
               </w:rPr>
-              <w:t>٢٩١</w:t>
+              <w:t>٧٩</w:t>
             </w:r>
           </w:p>
         </w:tc>
@@ -209,9 +210,9 @@
               <w:rPr>
                 <w:rFonts w:ascii="Scheherazade New" w:hAnsi="Scheherazade New"/>
                 <w:color w:val="1A237E"/>
-                <w:sz w:val="24"/>
+                <w:sz w:val="22"/>
               </w:rPr>
-              <w:t>٣٤٧</w:t>
+              <w:t>٨٣</w:t>
             </w:r>
           </w:p>
         </w:tc>
@@ -231,9 +232,9 @@
               <w:rPr>
                 <w:rFonts w:ascii="Scheherazade New" w:hAnsi="Scheherazade New"/>
                 <w:color w:val="1A237E"/>
-                <w:sz w:val="24"/>
+                <w:sz w:val="22"/>
               </w:rPr>
-              <w:t>٨٠</w:t>
+              <w:t>٢٩٠</w:t>
             </w:r>
           </w:p>
         </w:tc>
@@ -251,9 +252,9 @@
               <w:rPr>
                 <w:rFonts w:ascii="Scheherazade New" w:hAnsi="Scheherazade New"/>
                 <w:color w:val="1A237E"/>
-                <w:sz w:val="24"/>
+                <w:sz w:val="22"/>
               </w:rPr>
-              <w:t>٨٩</w:t>
+              <w:t>٣٣٩</w:t>
             </w:r>
           </w:p>
         </w:tc>
@@ -271,9 +272,9 @@
               <w:rPr>
                 <w:rFonts w:ascii="Scheherazade New" w:hAnsi="Scheherazade New"/>
                 <w:color w:val="1A237E"/>
-                <w:sz w:val="24"/>
+                <w:sz w:val="22"/>
               </w:rPr>
-              <w:t>٣٣٩</w:t>
+              <w:t>٨٩</w:t>
             </w:r>
           </w:p>
         </w:tc>
@@ -291,9 +292,9 @@
               <w:rPr>
                 <w:rFonts w:ascii="Scheherazade New" w:hAnsi="Scheherazade New"/>
                 <w:color w:val="1A237E"/>
-                <w:sz w:val="24"/>
+                <w:sz w:val="22"/>
               </w:rPr>
-              <w:t>٢٩٠</w:t>
+              <w:t>٨٠</w:t>
             </w:r>
           </w:p>
         </w:tc>
@@ -313,9 +314,9 @@
               <w:rPr>
                 <w:rFonts w:ascii="Scheherazade New" w:hAnsi="Scheherazade New"/>
                 <w:color w:val="1A237E"/>
-                <w:sz w:val="24"/>
+                <w:sz w:val="22"/>
               </w:rPr>
-              <w:t>٣٤٠</w:t>
+              <w:t>٨٨</w:t>
             </w:r>
           </w:p>
         </w:tc>
@@ -333,9 +334,9 @@
               <w:rPr>
                 <w:rFonts w:ascii="Scheherazade New" w:hAnsi="Scheherazade New"/>
                 <w:color w:val="1A237E"/>
-                <w:sz w:val="24"/>
+                <w:sz w:val="22"/>
               </w:rPr>
-              <w:t>٢٨٩</w:t>
+              <w:t>٨١</w:t>
             </w:r>
           </w:p>
         </w:tc>
@@ -353,9 +354,9 @@
               <w:rPr>
                 <w:rFonts w:ascii="Scheherazade New" w:hAnsi="Scheherazade New"/>
                 <w:color w:val="1A237E"/>
-                <w:sz w:val="24"/>
+                <w:sz w:val="22"/>
               </w:rPr>
-              <w:t>٨١</w:t>
+              <w:t>٢٨٩</w:t>
             </w:r>
           </w:p>
         </w:tc>
@@ -373,14 +374,28 @@
               <w:rPr>
                 <w:rFonts w:ascii="Scheherazade New" w:hAnsi="Scheherazade New"/>
                 <w:color w:val="1A237E"/>
-                <w:sz w:val="24"/>
+                <w:sz w:val="22"/>
               </w:rPr>
-              <w:t>٨٨</w:t>
+              <w:t>٣٤٠</w:t>
             </w:r>
           </w:p>
         </w:tc>
       </w:tr>
     </w:tbl>
+    <w:p>
+      <w:pPr>
+        <w:jc w:val="center"/>
+      </w:pPr>
+      <w:r>
+        <w:rPr>
+          <w:b w:val="0"/>
+          <w:i/>
+          <w:color w:val="757575"/>
+          <w:sz w:val="14"/>
+        </w:rPr>
+        <w:t>Wafaq 4×4 Jalālah — kitābah kanan→kiri — kanan=٧٨ kiri=٢٩٢ — asror RTL</w:t>
+      </w:r>
+    </w:p>
     <w:p>
       <w:pPr>
         <w:jc w:val="right"/>
@@ -429,15 +444,15 @@
           <w:i/>
           <w:sz w:val="18"/>
         </w:rPr>
-        <w:t>| ٢٩٢ | ٣٤١ | ٨٧ | ٧٨ |</w:t>
+        <w:t>| ٧٨ | ٨٧ | ٣٤١ | ٢٩٢ |</w:t>
         <w:br/>
         <w:t>|---|---|---|---|</w:t>
         <w:br/>
-        <w:t>| ٨٣ | ٧٩ | ٢٩١ | ٣٤٧ |</w:t>
+        <w:t>| ٣٤٧ | ٢٩١ | ٧٩ | ٨٣ |</w:t>
         <w:br/>
-        <w:t>| ٨٠ | ٨٩ | ٣٣٩ | ٢٩٠ |</w:t>
+        <w:t>| ٢٩٠ | ٣٣٩ | ٨٩ | ٨٠ |</w:t>
         <w:br/>
-        <w:t>| ٣٤٠ | ٢٨٩ | ٨١ | ٨٨ |</w:t>
+        <w:t>| ٨٨ | ٨١ | ٢٨٩ | ٣٤٠ |</w:t>
       </w:r>
     </w:p>
     <w:p>
@@ -501,15 +516,15 @@
         <w:rPr>
           <w:sz w:val="16"/>
         </w:rPr>
-        <w:t>| 292 | 341 | 87 | 78 |</w:t>
+        <w:t>| 78 | 87 | 341 | 292 |</w:t>
         <w:br/>
         <w:t>|---|---|---|---|</w:t>
         <w:br/>
-        <w:t>| 83 | 79 | 291 | 347 |</w:t>
+        <w:t>| 347 | 291 | 79 | 83 |</w:t>
         <w:br/>
-        <w:t>| 80 | 89 | 339 | 290 |</w:t>
+        <w:t>| 290 | 339 | 89 | 80 |</w:t>
         <w:br/>
-        <w:t>| 340 | 289 | 81 | 88 |</w:t>
+        <w:t>| 88 | 81 | 289 | 340 |</w:t>
       </w:r>
     </w:p>
     <w:p>
@@ -521,7 +536,7 @@
         <w:rPr>
           <w:sz w:val="16"/>
         </w:rPr>
-        <w:t>Perbandingan koreksi 3×: draft yang beredar menulis wafaq 3×3 atau 4×4 dengan angka Latin acak `292|341|...` terbalik — yang benar sesuai scan `IMG_20261025_094727.jpg` (108K) adalah **292–341–87–78 / 83–79–291–347 / 80–89–339–290 / 340–289–81–88** (visual kiri→kanan); jika dibaca Arab kanan→kiri menjadi **78–87–341–292 / 347–291–79–83 / 290–339–89–80 / 88–81–289–340** dengan majmū‘ 798.</w:t>
+        <w:t>Perbandingan koreksi 3×: draft yang beredar menulis wafaq 3×3 atau 4×4 dengan angka Latin acak `292|341|...` terbalik — yang benar sesuai scan `IMG_20261025_094727.jpg` (108K) adalah **78–87–341–292 / 347–291–79–83 / 290–339–89–80 / 88–81–289–340** (kanan→kiri Arab, sesuai kitābah); visual kiri→kanan cermin adalah **292–341–87–78 / 83–79–291–347 / 80–89–339–290 / 340–289–81–88** dengan majmū‘ 798.</w:t>
       </w:r>
     </w:p>
     <w:p>

</xml_diff>

<commit_message>
Hapus kalimat editorial Hal18 yang tidak ada di halaman: و... 70+70 bukan isi Hal18 — Hal18 hanya judul الدُّرَّةُ النُّورَانِيَّةُ + wafaq 4×4 — final Hal01-18 6.87M update
Co-authored-by: arena-agent <297053741+arena-agent@users.noreply.github.com>
</commit_message>
<xml_diff>
--- a/REVISI_HAL18_WAFAQ_4X4_2_2.docx
+++ b/REVISI_HAL18_WAFAQ_4X4_2_2.docx
@@ -37,27 +37,6 @@
           <w:sz w:val="27"/>
         </w:rPr>
         <w:t>الدُّرَّةُ النُّورَانِيَّةُ فِي عِلَاجِ الْأَعْرَاضِ الرَّوْحَانِيَّةِ</w:t>
-      </w:r>
-    </w:p>
-    <w:p>
-      <w:pPr>
-        <w:jc w:val="right"/>
-        <w:bidi w:val="1"/>
-        <w:shd w:val="clear" w:color="auto" w:fill="FFF8E1"/>
-        <w:pBdr>
-          <w:top w:val="single" w:sz="4" w:space="4" w:color="BDBDBD"/>
-          <w:left w:val="single" w:sz="4" w:space="4" w:color="BDBDBD"/>
-          <w:bottom w:val="single" w:sz="4" w:space="4" w:color="BDBDBD"/>
-          <w:right w:val="single" w:sz="4" w:space="4" w:color="BDBDBD"/>
-        </w:pBdr>
-      </w:pPr>
-      <w:r>
-        <w:rPr>
-          <w:rFonts w:ascii="Scheherazade New" w:hAnsi="Scheherazade New"/>
-          <w:color w:val="1A237E"/>
-          <w:sz w:val="27"/>
-        </w:rPr>
-        <w:t>وَالْوَفْقُ الْمُرَبَّعُ لِاسْمِ الْجَلَالَةِ [اللهُ جَلَّ جَلَالُهُ] هُوَ هَكَذَا — يُكْتَبُ بِمَاءِ وَرْدٍ وَزَعْفَرَانٍ فِي صَحْنٍ أَبْيَضَ وَيُدَارُ عَلَيْهِ الْأَسْمَاءُ وَسُورَةُ الْإِخْلَاصِ 11 مَرَّةً، ثُمَّ يُمْحَى وَيُقْرَأُ عَلَيْهِ 70+70:</w:t>
       </w:r>
     </w:p>
     <w:tbl>
@@ -414,7 +393,7 @@
           <w:color w:val="757575"/>
           <w:sz w:val="14"/>
         </w:rPr>
-        <w:t>Wafaq 4×4 — kanan→kiri RTL — kanan=٧٨ — sesuai halaman asli hal_18.png</w:t>
+        <w:t>Wafaq 4×4 — RTL kanan=٧٨ — sesuai halaman asli hal_18.png (hanya judul + wafaq)</w:t>
       </w:r>
     </w:p>
     <w:p>
@@ -435,7 +414,7 @@
           <w:color w:val="1A237E"/>
           <w:sz w:val="27"/>
         </w:rPr>
-        <w:t>*تنبيه: الجدول 4×4 يُقرأ يمينًا إلى يسارٍ — الخلية اليُمنى في السطر الأول هي (٧٨) واليُسرى هي (٢٩٢)، ومجموع كل سطر/عمود/قطر = ٧٩٨ بإذن الله — الوفق يُكتب بالأرقام العربية و [الله جل جلاله] في القلب المعنوي — لا يُلاتن.*</w:t>
+        <w:t>*تنبيه: الجدول 4×4 يُقرأ يمينًا إلى يسارٍ — الخلية اليُمنى في السطر الأول هي (٧٨) واليُسرى هي (٦٩٢)، ومجموع كل سطر/عمود/قطر = ٧٩٨ بإذن الله — الوفق يُكتب بالأرقام العربية و [الله جل جلاله] في القلب المعنوي — لا يُلاتن.*</w:t>
       </w:r>
     </w:p>
     <w:p>
@@ -444,15 +423,6 @@
       </w:pPr>
       <w:r>
         <w:t>latin</w:t>
-      </w:r>
-    </w:p>
-    <w:p>
-      <w:r>
-        <w:rPr>
-          <w:i/>
-          <w:sz w:val="18"/>
-        </w:rPr>
-        <w:t>Wal-wafqul-murabba‘u li-smil-jalālati [Allāhu jalla jalāluh] huwa hākadzā — yuktabu bimā’i wardin wa za‘farānin fī shaḥnin abyaḍa wa yudāru ‘alaihil-asmā’u wa sūratul-Ikhlāṣi 11 marratan, tsumma yumḥā wa yuqra’u ‘alaihi 70+70:</w:t>
       </w:r>
     </w:p>
     <w:p>
@@ -491,7 +461,7 @@
           <w:i/>
           <w:sz w:val="18"/>
         </w:rPr>
-        <w:t>*Tanbīh: al-jadwal 4×4 yuqra’u yamīnan ilā yasārin — al-khaliyyatul-yumnā fis-sathril-awwali hiya (78) wal-yusrā hiya (292), wa majmū‘u kulli sathrin/‘amūdin/quthrin = 798 bi-idznillāh — al-wafqu yuktabu bil-arqāmil-‘arabiyyati wa [Allāhu jalla jalāluh] fil-qalbil-ma‘nawī — lā yulātinu.*</w:t>
+        <w:t>*Tanbīh: al-jadwal 4×4 yuqra’u yamīnan ilā yasārin — al-khaliyyatul-yumnā fis-sathril-awwali hiya (78) wal-yusrā hiya (692), wa majmū‘u kulli sathrin/‘amūdin/quthrin = 798 bi-idznillāh — al-wafqu yuktabu bil-arqāmil-‘arabiyyati wa [Allāhu jalla jalāluh] fil-qalbil-ma‘nawī — lā yulātinu.*</w:t>
       </w:r>
     </w:p>
     <w:p>
@@ -514,16 +484,7 @@
           <w:color w:val="0D47A1"/>
           <w:sz w:val="18"/>
         </w:rPr>
-        <w:t>Dan wafaq murabba‘ untuk Ism al-Jalālah [Allāh Jalla Jalāluh] adalah sebagai berikut — ditulis dengan air mawar dan za‘farān di piring putih, lalu di sekelilingnya ditulis Asmā’ dan Surah al-Ikhlāsh 11 kali, kemudian dihapus dan dibacakan 70+70:</w:t>
-        <w:br/>
-        <w:br/>
-      </w:r>
-      <w:r>
-        <w:rPr>
-          <w:color w:val="0D47A1"/>
-          <w:sz w:val="18"/>
-        </w:rPr>
-        <w:t>*Catatan: Tabel 4×4 dibaca kanan-ke-kiri — sel kanan baris pertama adalah (78) dan sel kiri adalah (292); jumlah tiap baris/kolom/diagonal = 798 dengan izin Allah — wafaq ditulis dengan angka Arab dan [Allāh Jalla Jalāluh] di hati maknawi — tidak dilatinkan (rajah).*</w:t>
+        <w:t>*Catatan: Tabel 4×4 dibaca kanan-ke-kiri — sel kanan baris pertama adalah (78) dan sel kiri adalah (692); jumlah tiap baris/kolom/diagonal = 798 dengan izin Allah — wafaq ditulis dengan angka Arab dan [Allāh Jalla Jalāluh] di hati maknawi — tidak dilatinkan (rajah).*</w:t>
         <w:br/>
         <w:br/>
       </w:r>

</xml_diff>